<commit_message>
feat: COMPLETE 7-agent LangGraph pipeline - Filing+Extraction+Valuation+News+RAG+InvestmentRec+ReportGen+QA all passing
</commit_message>
<xml_diff>
--- a/data/reports/AAPL_Investment_Report_20260615.docx
+++ b/data/reports/AAPL_Investment_Report_20260615.docx
@@ -302,7 +302,7 @@
         <w:rPr>
           <w:sz w:val="22"/>
         </w:rPr>
-        <w:t>$296.22</w:t>
+        <w:t>$296.30</w:t>
       </w:r>
     </w:p>
     <w:p>
@@ -446,7 +446,7 @@
         <w:rPr>
           <w:sz w:val="22"/>
         </w:rPr>
-        <w:t>+5.6%</w:t>
+        <w:t>+5.5%</w:t>
       </w:r>
     </w:p>
     <w:p/>
@@ -615,7 +615,7 @@
           <w:b/>
           <w:sz w:val="24"/>
         </w:rPr>
-        <w:t>MEMORANDUM</w:t>
+        <w:t>MEMO</w:t>
       </w:r>
     </w:p>
     <w:p>
@@ -631,7 +631,7 @@
         <w:rPr>
           <w:sz w:val="20"/>
         </w:rPr>
-        <w:t>FROM: [Your Name], Senior Investment Analyst</w:t>
+        <w:t>FROM: Senior Investment Analyst</w:t>
       </w:r>
     </w:p>
     <w:p>
@@ -639,7 +639,7 @@
         <w:rPr>
           <w:sz w:val="20"/>
         </w:rPr>
-        <w:t>DATE: [Current Date]</w:t>
+        <w:t>DATE: [Insert Date]</w:t>
       </w:r>
     </w:p>
     <w:p>
@@ -665,7 +665,7 @@
         <w:rPr>
           <w:sz w:val="20"/>
         </w:rPr>
-        <w:t>Apple Inc. (AAPL) currently presents a challenging investment landscape, with a current market price of $296.22 significantly above its DCF intrinsic value of $144.36, indicating a potential downside of 51.3%. Given the current valuation metrics and market sentiment, I recommend a SELL position on AAPL.</w:t>
+        <w:t>Apple Inc. (AAPL) presents a compelling case for caution in the current market environment. Despite strong financial performance, the significant disparity between its intrinsic value and market price suggests overvaluation. Therefore, I recommend a SELL position on AAPL.</w:t>
       </w:r>
     </w:p>
     <w:p/>
@@ -683,7 +683,7 @@
         <w:rPr>
           <w:sz w:val="20"/>
         </w:rPr>
-        <w:t>- Overvaluation Concerns: AAPL’s current price of $296.22 is substantially higher than the DCF intrinsic value of $144.36, suggesting that the stock is overvalued by more than 50%.</w:t>
+        <w:t>- Overvaluation Concerns: The current market price of $296.30 significantly exceeds the DCF intrinsic value of $144.36, indicating a downside potential of 51.3%.</w:t>
       </w:r>
     </w:p>
     <w:p>
@@ -691,7 +691,7 @@
         <w:rPr>
           <w:sz w:val="20"/>
         </w:rPr>
-        <w:t>- High Debt Levels: The company has a Debt/Equity ratio of 3.87x, indicating a reliance on debt financing that could pose risks in a rising interest rate environment.</w:t>
+        <w:t>- High Leverage: AAPL's debt-to-equity ratio stands at 3.87x, suggesting a reliance on debt financing that could pose risks in a rising interest rate environment.</w:t>
       </w:r>
     </w:p>
     <w:p>
@@ -699,7 +699,7 @@
         <w:rPr>
           <w:sz w:val="20"/>
         </w:rPr>
-        <w:t>- Neutral Market Sentiment: The overall news sentiment is neutral (+0.150), with a slight tilt towards bearish views, which may limit upside potential in the near term.</w:t>
+        <w:t>- Market Sentiment: The overall neutral sentiment, with a slight bullish tilt, does not provide sufficient momentum to justify the current valuation, especially given the risks highlighted in the 10-K filings.</w:t>
       </w:r>
     </w:p>
     <w:p/>
@@ -717,7 +717,7 @@
         <w:rPr>
           <w:sz w:val="20"/>
         </w:rPr>
-        <w:t>- Revenue: $416.16B, reflecting strong sales growth.</w:t>
+        <w:t>- Revenue: $416.16 billion</w:t>
       </w:r>
     </w:p>
     <w:p>
@@ -725,7 +725,7 @@
         <w:rPr>
           <w:sz w:val="20"/>
         </w:rPr>
-        <w:t>- Net Income: $112.01B, resulting in a robust net profit margin of 26.9%.</w:t>
+        <w:t>- Net Income: $112.01 billion</w:t>
       </w:r>
     </w:p>
     <w:p>
@@ -733,7 +733,7 @@
         <w:rPr>
           <w:sz w:val="20"/>
         </w:rPr>
-        <w:t>- EPS (Diluted): $7.46, showcasing solid earnings performance.</w:t>
+        <w:t>- EPS (Diluted): $7.46</w:t>
       </w:r>
     </w:p>
     <w:p>
@@ -741,7 +741,7 @@
         <w:rPr>
           <w:sz w:val="20"/>
         </w:rPr>
-        <w:t>- Return on Equity (ROE): An impressive 151.9%, indicating effective management of shareholder equity.</w:t>
+        <w:t>- Net Profit Margin: 26.9%</w:t>
       </w:r>
     </w:p>
     <w:p>
@@ -749,7 +749,15 @@
         <w:rPr>
           <w:sz w:val="20"/>
         </w:rPr>
-        <w:t>- Debt/Equity Ratio: At 3.87x, this high leverage could be a concern for future financial stability.</w:t>
+        <w:t>- Return on Equity (ROE): 151.9%</w:t>
+      </w:r>
+    </w:p>
+    <w:p>
+      <w:r>
+        <w:rPr>
+          <w:sz w:val="20"/>
+        </w:rPr>
+        <w:t>AAPL's robust revenue and net income reflect strong operational efficiency, but the high ROE is partially driven by its significant leverage, which raises concerns about sustainability.</w:t>
       </w:r>
     </w:p>
     <w:p/>
@@ -767,7 +775,7 @@
         <w:rPr>
           <w:sz w:val="20"/>
         </w:rPr>
-        <w:t>1. Macroeconomic and Industry Risks: AAPL's performance is susceptible to global economic fluctuations, which could impact consumer spending on premium products.</w:t>
+        <w:t>According to the latest 10-K filings, the following risks are noteworthy:</w:t>
       </w:r>
     </w:p>
     <w:p>
@@ -775,7 +783,7 @@
         <w:rPr>
           <w:sz w:val="20"/>
         </w:rPr>
-        <w:t>2. Technological Integration Risks: The company’s commitment to integrating new technologies, such as AI and machine learning, poses risks if these initiatives do not meet market expectations or face significant competition.</w:t>
+        <w:t>1. Macroeconomic and Industry Risks: AAPL's performance is sensitive to global economic conditions, which can impact consumer spending and demand for its products.</w:t>
       </w:r>
     </w:p>
     <w:p>
@@ -783,7 +791,15 @@
         <w:rPr>
           <w:sz w:val="20"/>
         </w:rPr>
-        <w:t>3. Supply Chain Vulnerabilities: Disruptions in the supply chain, whether due to geopolitical tensions or global health crises, could adversely affect production and sales.</w:t>
+        <w:t>2. Technological Integration Risks: The company faces challenges in effectively integrating emerging technologies, such as machine learning and AI, which are critical for maintaining competitive advantage.</w:t>
+      </w:r>
+    </w:p>
+    <w:p>
+      <w:r>
+        <w:rPr>
+          <w:sz w:val="20"/>
+        </w:rPr>
+        <w:t>3. Supply Chain Vulnerabilities: Disruptions in the global supply chain, exacerbated by geopolitical tensions or pandemics, could adversely affect production and product availability.</w:t>
       </w:r>
     </w:p>
     <w:p/>
@@ -801,7 +817,7 @@
         <w:rPr>
           <w:sz w:val="20"/>
         </w:rPr>
-        <w:t>The DCF analysis indicates an intrinsic value of $144.36 for AAPL, representing a significant downside of 51.3% from the current market price of $296.22. In contrast, the analyst consensus target price of $312.72 suggests a modest upside potential. However, the substantial gap between the DCF valuation and the current market price raises concerns about the sustainability of AAPL's valuation in the current economic climate.</w:t>
+        <w:t>The DCF analysis indicates an intrinsic value of $144.36, which is substantially lower than the current market price of $296.30. This discrepancy highlights a potential overvaluation of 51.3%. Additionally, the analyst consensus target price of $312.72 suggests limited upside potential, further supporting the recommendation to sell.</w:t>
       </w:r>
     </w:p>
     <w:p/>
@@ -819,7 +835,7 @@
         <w:rPr>
           <w:sz w:val="20"/>
         </w:rPr>
-        <w:t>Based on the analysis of financial metrics, valuation discrepancies, and prevailing risk factors, I recommend a SELL rating for Apple Inc. (AAPL) with a 12-month price target of $144.36, aligning with the DCF intrinsic value assessment.</w:t>
+        <w:t>Given the overvaluation, high leverage, and existing risks, I recommend a SELL position on Apple Inc. with a 12-month price target of $144.36, aligning with the DCF intrinsic value assessment.</w:t>
       </w:r>
     </w:p>
     <w:p/>
@@ -829,7 +845,7 @@
           <w:b/>
           <w:sz w:val="24"/>
         </w:rPr>
-        <w:t>[End of Memo]</w:t>
+        <w:t>End of Memo</w:t>
       </w:r>
     </w:p>
     <w:p>

</xml_diff>

<commit_message>
feat: Streamlit dashboard complete - full 7-agent pipeline with live UI, charts, agent trace, DOCX download
</commit_message>
<xml_diff>
--- a/data/reports/AAPL_Investment_Report_20260615.docx
+++ b/data/reports/AAPL_Investment_Report_20260615.docx
@@ -302,7 +302,7 @@
         <w:rPr>
           <w:sz w:val="22"/>
         </w:rPr>
-        <w:t>$296.30</w:t>
+        <w:t>$296.27</w:t>
       </w:r>
     </w:p>
     <w:p>
@@ -446,7 +446,7 @@
         <w:rPr>
           <w:sz w:val="22"/>
         </w:rPr>
-        <w:t>+5.5%</w:t>
+        <w:t>+5.6%</w:t>
       </w:r>
     </w:p>
     <w:p/>
@@ -615,7 +615,7 @@
           <w:b/>
           <w:sz w:val="24"/>
         </w:rPr>
-        <w:t>MEMO</w:t>
+        <w:t>MEMORANDUM</w:t>
       </w:r>
     </w:p>
     <w:p>
@@ -639,7 +639,7 @@
         <w:rPr>
           <w:sz w:val="20"/>
         </w:rPr>
-        <w:t>DATE: [Insert Date]</w:t>
+        <w:t>DATE: October 2023</w:t>
       </w:r>
     </w:p>
     <w:p>
@@ -665,7 +665,7 @@
         <w:rPr>
           <w:sz w:val="20"/>
         </w:rPr>
-        <w:t>Apple Inc. (AAPL) presents a compelling case for caution in the current market environment. Despite strong financial performance, the significant disparity between its intrinsic value and market price suggests overvaluation. Therefore, I recommend a SELL position on AAPL.</w:t>
+        <w:t>Apple Inc. (AAPL) presents a challenging investment outlook at its current price of $296.27, with a recommendation to SELL. Despite strong financial performance, the significant disparity between the DCF intrinsic value of $144.36 and the current market price suggests that AAPL is overvalued.</w:t>
       </w:r>
     </w:p>
     <w:p/>
@@ -683,7 +683,7 @@
         <w:rPr>
           <w:sz w:val="20"/>
         </w:rPr>
-        <w:t>- Overvaluation Concerns: The current market price of $296.30 significantly exceeds the DCF intrinsic value of $144.36, indicating a downside potential of 51.3%.</w:t>
+        <w:t>- Strong Financial Performance: AAPL reported a revenue of $416.16 billion and a net income of $112.01 billion, demonstrating robust profitability with a net profit margin of 26.9% and an impressive return on equity (ROE) of 151.9%.</w:t>
       </w:r>
     </w:p>
     <w:p>
@@ -691,7 +691,7 @@
         <w:rPr>
           <w:sz w:val="20"/>
         </w:rPr>
-        <w:t>- High Leverage: AAPL's debt-to-equity ratio stands at 3.87x, suggesting a reliance on debt financing that could pose risks in a rising interest rate environment.</w:t>
+        <w:t>- High Debt Levels: The company’s debt-to-equity ratio stands at 3.87x, indicating a high level of leverage that could pose risks in a rising interest rate environment or economic downturn.</w:t>
       </w:r>
     </w:p>
     <w:p>
@@ -699,7 +699,7 @@
         <w:rPr>
           <w:sz w:val="20"/>
         </w:rPr>
-        <w:t>- Market Sentiment: The overall neutral sentiment, with a slight bullish tilt, does not provide sufficient momentum to justify the current valuation, especially given the risks highlighted in the 10-K filings.</w:t>
+        <w:t>- Market Sentiment and Valuation Concerns: The analyst consensus target price of $312.72 is marginally above the current price, while the DCF analysis indicates a significant downside of 51.3%. This discrepancy raises concerns about future growth expectations and market sentiment.</w:t>
       </w:r>
     </w:p>
     <w:p/>
@@ -733,7 +733,7 @@
         <w:rPr>
           <w:sz w:val="20"/>
         </w:rPr>
-        <w:t>- EPS (Diluted): $7.46</w:t>
+        <w:t>- Earnings Per Share (EPS): $7.46</w:t>
       </w:r>
     </w:p>
     <w:p>
@@ -757,7 +757,15 @@
         <w:rPr>
           <w:sz w:val="20"/>
         </w:rPr>
-        <w:t>AAPL's robust revenue and net income reflect strong operational efficiency, but the high ROE is partially driven by its significant leverage, which raises concerns about sustainability.</w:t>
+        <w:t>- Debt/Equity Ratio: 3.87x</w:t>
+      </w:r>
+    </w:p>
+    <w:p>
+      <w:r>
+        <w:rPr>
+          <w:sz w:val="20"/>
+        </w:rPr>
+        <w:t>These metrics reflect a strong operational performance; however, the high leverage ratio is a critical factor to monitor.</w:t>
       </w:r>
     </w:p>
     <w:p/>
@@ -775,7 +783,7 @@
         <w:rPr>
           <w:sz w:val="20"/>
         </w:rPr>
-        <w:t>According to the latest 10-K filings, the following risks are noteworthy:</w:t>
+        <w:t>1. Macroeconomic and Industry Risks: AAPL's performance is highly sensitive to global economic conditions, which can impact consumer spending and demand for its products.</w:t>
       </w:r>
     </w:p>
     <w:p>
@@ -783,7 +791,7 @@
         <w:rPr>
           <w:sz w:val="20"/>
         </w:rPr>
-        <w:t>1. Macroeconomic and Industry Risks: AAPL's performance is sensitive to global economic conditions, which can impact consumer spending and demand for its products.</w:t>
+        <w:t>2. Technological Integration Risks: The company faces challenges in integrating new technologies, such as machine learning and artificial intelligence, which are essential for maintaining competitive advantage.</w:t>
       </w:r>
     </w:p>
     <w:p>
@@ -791,15 +799,7 @@
         <w:rPr>
           <w:sz w:val="20"/>
         </w:rPr>
-        <w:t>2. Technological Integration Risks: The company faces challenges in effectively integrating emerging technologies, such as machine learning and AI, which are critical for maintaining competitive advantage.</w:t>
-      </w:r>
-    </w:p>
-    <w:p>
-      <w:r>
-        <w:rPr>
-          <w:sz w:val="20"/>
-        </w:rPr>
-        <w:t>3. Supply Chain Vulnerabilities: Disruptions in the global supply chain, exacerbated by geopolitical tensions or pandemics, could adversely affect production and product availability.</w:t>
+        <w:t>3. Market Competition: The technology sector is characterized by rapid innovation and intense competition, which could affect AAPL's market share and profitability.</w:t>
       </w:r>
     </w:p>
     <w:p/>
@@ -817,7 +817,7 @@
         <w:rPr>
           <w:sz w:val="20"/>
         </w:rPr>
-        <w:t>The DCF analysis indicates an intrinsic value of $144.36, which is substantially lower than the current market price of $296.30. This discrepancy highlights a potential overvaluation of 51.3%. Additionally, the analyst consensus target price of $312.72 suggests limited upside potential, further supporting the recommendation to sell.</w:t>
+        <w:t>The current market price of AAPL at $296.27 is significantly above the DCF-derived intrinsic value of $144.36, indicating a potential overvaluation of 51.3%. The analyst consensus target price of $312.72 suggests limited upside potential, reinforcing the view that the stock may not be a favorable investment at this time.</w:t>
       </w:r>
     </w:p>
     <w:p/>
@@ -835,7 +835,7 @@
         <w:rPr>
           <w:sz w:val="20"/>
         </w:rPr>
-        <w:t>Given the overvaluation, high leverage, and existing risks, I recommend a SELL position on Apple Inc. with a 12-month price target of $144.36, aligning with the DCF intrinsic value assessment.</w:t>
+        <w:t>SELL with a 12-month price target of $144.36 based on DCF analysis. Given the current valuation metrics and inherent risks, investors should consider reallocating their investments to more attractive opportunities.</w:t>
       </w:r>
     </w:p>
     <w:p/>
@@ -845,7 +845,7 @@
           <w:b/>
           <w:sz w:val="24"/>
         </w:rPr>
-        <w:t>End of Memo</w:t>
+        <w:t>END OF MEMO</w:t>
       </w:r>
     </w:p>
     <w:p>

</xml_diff>